<commit_message>
ISO 27001: DOC-03 cela jmena v tabulce roli (Ondrej Pillar, Kristyna Maresova, Jiri Honomichl, Sarka Novotna) - v0.2 - Kristy/Claude-24
</commit_message>
<xml_diff>
--- a/docs/ISO27001/DOC-03_Role_a_odpovednosti.docx
+++ b/docs/ISO27001/DOC-03_Role_a_odpovednosti.docx
@@ -196,7 +196,7 @@
                 <w:sz w:val="20"/>
                 <w:szCs w:val="20"/>
               </w:rPr>
-              <w:t xml:space="preserve">0.1 (návrh)</w:t>
+              <w:t xml:space="preserve">0.2 (návrh)</w:t>
             </w:r>
           </w:p>
         </w:tc>
@@ -846,6 +846,136 @@
           </w:p>
         </w:tc>
       </w:tr>
+      <w:tr>
+        <w:tc>
+          <w:tcPr>
+            <w:tcW w:type="dxa" w:w="1400"/>
+            <w:tcBorders>
+              <w:top w:val="single" w:color="BBBBBB" w:sz="1"/>
+              <w:left w:val="single" w:color="BBBBBB" w:sz="1"/>
+              <w:bottom w:val="single" w:color="BBBBBB" w:sz="1"/>
+              <w:right w:val="single" w:color="BBBBBB" w:sz="1"/>
+            </w:tcBorders>
+            <w:tcMar>
+              <w:top w:type="dxa" w:w="60"/>
+              <w:left w:type="dxa" w:w="110"/>
+              <w:bottom w:type="dxa" w:w="60"/>
+              <w:right w:type="dxa" w:w="110"/>
+            </w:tcMar>
+            <w:vAlign w:val="center"/>
+          </w:tcPr>
+          <w:p>
+            <w:pPr>
+              <w:spacing w:after="0" w:line="252"/>
+            </w:pPr>
+            <w:r>
+              <w:rPr>
+                <w:b w:val="false"/>
+                <w:bCs w:val="false"/>
+                <w:sz w:val="20"/>
+                <w:szCs w:val="20"/>
+              </w:rPr>
+              <w:t xml:space="preserve">0.2</w:t>
+            </w:r>
+          </w:p>
+        </w:tc>
+        <w:tc>
+          <w:tcPr>
+            <w:tcW w:type="dxa" w:w="1800"/>
+            <w:tcBorders>
+              <w:top w:val="single" w:color="BBBBBB" w:sz="1"/>
+              <w:left w:val="single" w:color="BBBBBB" w:sz="1"/>
+              <w:bottom w:val="single" w:color="BBBBBB" w:sz="1"/>
+              <w:right w:val="single" w:color="BBBBBB" w:sz="1"/>
+            </w:tcBorders>
+            <w:tcMar>
+              <w:top w:type="dxa" w:w="60"/>
+              <w:left w:type="dxa" w:w="110"/>
+              <w:bottom w:type="dxa" w:w="60"/>
+              <w:right w:type="dxa" w:w="110"/>
+            </w:tcMar>
+            <w:vAlign w:val="center"/>
+          </w:tcPr>
+          <w:p>
+            <w:pPr>
+              <w:spacing w:after="0" w:line="252"/>
+            </w:pPr>
+            <w:r>
+              <w:rPr>
+                <w:b w:val="false"/>
+                <w:bCs w:val="false"/>
+                <w:sz w:val="20"/>
+                <w:szCs w:val="20"/>
+              </w:rPr>
+              <w:t xml:space="preserve">13. 7. 2026</w:t>
+            </w:r>
+          </w:p>
+        </w:tc>
+        <w:tc>
+          <w:tcPr>
+            <w:tcW w:type="dxa" w:w="3826"/>
+            <w:tcBorders>
+              <w:top w:val="single" w:color="BBBBBB" w:sz="1"/>
+              <w:left w:val="single" w:color="BBBBBB" w:sz="1"/>
+              <w:bottom w:val="single" w:color="BBBBBB" w:sz="1"/>
+              <w:right w:val="single" w:color="BBBBBB" w:sz="1"/>
+            </w:tcBorders>
+            <w:tcMar>
+              <w:top w:type="dxa" w:w="60"/>
+              <w:left w:type="dxa" w:w="110"/>
+              <w:bottom w:type="dxa" w:w="60"/>
+              <w:right w:type="dxa" w:w="110"/>
+            </w:tcMar>
+            <w:vAlign w:val="center"/>
+          </w:tcPr>
+          <w:p>
+            <w:pPr>
+              <w:spacing w:after="0" w:line="252"/>
+            </w:pPr>
+            <w:r>
+              <w:rPr>
+                <w:b w:val="false"/>
+                <w:bCs w:val="false"/>
+                <w:sz w:val="20"/>
+                <w:szCs w:val="20"/>
+              </w:rPr>
+              <w:t xml:space="preserve">Doplněna celá jména osob v tabulce rolí</w:t>
+            </w:r>
+          </w:p>
+        </w:tc>
+        <w:tc>
+          <w:tcPr>
+            <w:tcW w:type="dxa" w:w="2000"/>
+            <w:tcBorders>
+              <w:top w:val="single" w:color="BBBBBB" w:sz="1"/>
+              <w:left w:val="single" w:color="BBBBBB" w:sz="1"/>
+              <w:bottom w:val="single" w:color="BBBBBB" w:sz="1"/>
+              <w:right w:val="single" w:color="BBBBBB" w:sz="1"/>
+            </w:tcBorders>
+            <w:tcMar>
+              <w:top w:type="dxa" w:w="60"/>
+              <w:left w:type="dxa" w:w="110"/>
+              <w:bottom w:type="dxa" w:w="60"/>
+              <w:right w:type="dxa" w:w="110"/>
+            </w:tcMar>
+            <w:vAlign w:val="center"/>
+          </w:tcPr>
+          <w:p>
+            <w:pPr>
+              <w:spacing w:after="0" w:line="252"/>
+            </w:pPr>
+            <w:r>
+              <w:rPr>
+                <w:b w:val="false"/>
+                <w:bCs w:val="false"/>
+                <w:sz w:val="20"/>
+                <w:szCs w:val="20"/>
+              </w:rPr>
+              <w:t xml:space="preserve">STRATEGIE / Claude-24</w:t>
+            </w:r>
+          </w:p>
+        </w:tc>
+      </w:tr>
     </w:tbl>
     <w:p>
       <w:pPr>
@@ -1302,7 +1432,7 @@
                 <w:sz w:val="20"/>
                 <w:szCs w:val="20"/>
               </w:rPr>
-              <w:t xml:space="preserve">Ondra</w:t>
+              <w:t xml:space="preserve">Ondřej Pillár</w:t>
             </w:r>
           </w:p>
         </w:tc>
@@ -1400,7 +1530,7 @@
                 <w:sz w:val="20"/>
                 <w:szCs w:val="20"/>
               </w:rPr>
-              <w:t xml:space="preserve">Kristý</w:t>
+              <w:t xml:space="preserve">Kristýna Marešová</w:t>
             </w:r>
           </w:p>
         </w:tc>
@@ -1498,7 +1628,7 @@
                 <w:sz w:val="20"/>
                 <w:szCs w:val="20"/>
               </w:rPr>
-              <w:t xml:space="preserve">Jirka</w:t>
+              <w:t xml:space="preserve">Jiří Honomichl</w:t>
             </w:r>
           </w:p>
         </w:tc>
@@ -1596,7 +1726,7 @@
                 <w:sz w:val="20"/>
                 <w:szCs w:val="20"/>
               </w:rPr>
-              <w:t xml:space="preserve">Šárka</w:t>
+              <w:t xml:space="preserve">Šárka Novotná</w:t>
             </w:r>
           </w:p>
         </w:tc>
@@ -1893,7 +2023,7 @@
         <w:sz w:val="15"/>
         <w:szCs w:val="15"/>
       </w:rPr>
-      <w:t xml:space="preserve">Role a odpovědnosti v ISMS  ·  verze 0.1</w:t>
+      <w:t xml:space="preserve">Role a odpovědnosti v ISMS  ·  verze 0.2</w:t>
     </w:r>
     <w:r>
       <w:rPr>

</xml_diff>